<commit_message>
Initial Zoro app implementation
</commit_message>
<xml_diff>
--- a/grok-zoro.docx
+++ b/grok-zoro.docx
@@ -4,21 +4,32 @@
   <w:body>
     <w:p>
       <w:r>
-        <w:t># Clarity - GTD App | Part 1: Architecture, Domain &amp; Project Structure</w:t>
-      </w:r>
-    </w:p>
-    <w:p/>
+        <w:t xml:space="preserve"># </w:t>
+      </w:r>
+      <w:r>
+        <w:t>Zoro</w:t>
+      </w:r>
+      <w:r>
+        <w:t>| Part 1: Architecture, Domain &amp; Project Structure</w:t>
+      </w:r>
+    </w:p>
+    <w:p/>
+    <w:p>
+      <w:r>
+        <w:t>**Version:** 1.1</w:t>
+      </w:r>
+    </w:p>
     <w:p>
       <w:r>
         <w:t>**</w:t>
       </w:r>
       <w:proofErr w:type="gramStart"/>
       <w:r>
-        <w:t>Version:*</w:t>
-      </w:r>
-      <w:proofErr w:type="gramEnd"/>
-      <w:r>
-        <w:t xml:space="preserve">* 1.0  </w:t>
+        <w:t>Date:*</w:t>
+      </w:r>
+      <w:proofErr w:type="gramEnd"/>
+      <w:r>
+        <w:t xml:space="preserve">* May 2026  </w:t>
       </w:r>
     </w:p>
     <w:p>
@@ -27,11 +38,11 @@
       </w:r>
       <w:proofErr w:type="gramStart"/>
       <w:r>
-        <w:t>Date:*</w:t>
-      </w:r>
-      <w:proofErr w:type="gramEnd"/>
-      <w:r>
-        <w:t xml:space="preserve">* May 2026  </w:t>
+        <w:t>Framework:*</w:t>
+      </w:r>
+      <w:proofErr w:type="gramEnd"/>
+      <w:r>
+        <w:t xml:space="preserve">* Flutter  </w:t>
       </w:r>
     </w:p>
     <w:p>
@@ -40,11 +51,19 @@
       </w:r>
       <w:proofErr w:type="gramStart"/>
       <w:r>
-        <w:t>Framework:*</w:t>
-      </w:r>
-      <w:proofErr w:type="gramEnd"/>
-      <w:r>
-        <w:t xml:space="preserve">* Flutter  </w:t>
+        <w:t>Architecture:*</w:t>
+      </w:r>
+      <w:proofErr w:type="gramEnd"/>
+      <w:r>
+        <w:t xml:space="preserve">* Clean Architecture + </w:t>
+      </w:r>
+      <w:proofErr w:type="spellStart"/>
+      <w:r>
+        <w:t>Riverpod</w:t>
+      </w:r>
+      <w:proofErr w:type="spellEnd"/>
+      <w:r>
+        <w:t xml:space="preserve"> 2.x  </w:t>
       </w:r>
     </w:p>
     <w:p>
@@ -53,41 +72,20 @@
       </w:r>
       <w:proofErr w:type="gramStart"/>
       <w:r>
-        <w:t>Architecture:*</w:t>
-      </w:r>
-      <w:proofErr w:type="gramEnd"/>
-      <w:r>
-        <w:t xml:space="preserve">* Clean Architecture + </w:t>
-      </w:r>
-      <w:proofErr w:type="spellStart"/>
-      <w:r>
-        <w:t>Riverpod</w:t>
-      </w:r>
-      <w:proofErr w:type="spellEnd"/>
-      <w:r>
-        <w:t xml:space="preserve"> 2.x  </w:t>
-      </w:r>
-    </w:p>
-    <w:p>
+        <w:t>UI:*</w:t>
+      </w:r>
+      <w:proofErr w:type="gramEnd"/>
+      <w:r>
+        <w:t xml:space="preserve">* Material 3  </w:t>
+      </w:r>
+    </w:p>
+    <w:p>
+      <w:bookmarkStart w:id="0" w:name="OLE_LINK1"/>
       <w:r>
         <w:t>**</w:t>
       </w:r>
       <w:proofErr w:type="gramStart"/>
       <w:r>
-        <w:t>UI:*</w:t>
-      </w:r>
-      <w:proofErr w:type="gramEnd"/>
-      <w:r>
-        <w:t xml:space="preserve">* Material 3  </w:t>
-      </w:r>
-    </w:p>
-    <w:p>
-      <w:bookmarkStart w:id="0" w:name="OLE_LINK1"/>
-      <w:r>
-        <w:t>**</w:t>
-      </w:r>
-      <w:proofErr w:type="gramStart"/>
-      <w:r>
         <w:t>Database:*</w:t>
       </w:r>
       <w:proofErr w:type="gramEnd"/>
@@ -126,6 +124,12 @@
     <w:p>
       <w:r>
         <w:t>- Support voice input as a first-class feature.</w:t>
+      </w:r>
+    </w:p>
+    <w:p>
+      <w:pPr/>
+      <w:r>
+        <w:t>- Support safe import/export workflows for migration, backup, and mind sweep capture.</w:t>
       </w:r>
     </w:p>
     <w:p/>
@@ -1069,7 +1073,13 @@
     <w:p/>
     <w:p>
       <w:r>
-        <w:t># Clarity - GTD App | Part 2: Detailed UI/UX Screen Specifications</w:t>
+        <w:t xml:space="preserve"># </w:t>
+      </w:r>
+      <w:r>
+        <w:t>Zoro</w:t>
+      </w:r>
+      <w:r>
+        <w:t>| Part 2: Detailed UI/UX Screen Specifications</w:t>
       </w:r>
     </w:p>
     <w:p/>
@@ -1490,15 +1500,7 @@
     <w:p/>
     <w:p>
       <w:r>
-        <w:t xml:space="preserve">**Top </w:t>
-      </w:r>
-      <w:proofErr w:type="gramStart"/>
-      <w:r>
-        <w:t>Tabs:*</w:t>
-      </w:r>
-      <w:proofErr w:type="gramEnd"/>
-      <w:r>
-        <w:t>* By Context | All Next Actions | By Project</w:t>
+        <w:t>**Top Filters:** All | Today | Next 7 days | By Context | By Project</w:t>
       </w:r>
     </w:p>
     <w:p/>
@@ -1729,15 +1731,114 @@
       </w:r>
     </w:p>
     <w:p>
+      <w:pPr/>
+      <w:r>
+        <w:t>- **Settings Import/Backup** - Copy JSON backup, restore JSON backup with confirmation, and bulk upload `.xlsx` task captures into Inbox.</w:t>
+      </w:r>
+    </w:p>
+    <w:p>
       <w:r>
         <w:t>- **Archive Screen**</w:t>
       </w:r>
     </w:p>
-    <w:p/>
-    <w:p/>
-    <w:p>
-      <w:r>
-        <w:t xml:space="preserve"># Clarity - GTD App | Part 3: </w:t>
+    <w:p>
+      <w:pPr/>
+    </w:p>
+    <w:p>
+      <w:pPr/>
+      <w:r>
+        <w:t>## 2.10 Settings Import, Backup, and Bulk Capture</w:t>
+      </w:r>
+    </w:p>
+    <w:p>
+      <w:pPr/>
+      <w:r>
+        <w:t>**Purpose:** Help users migrate from other tools, run mind sweeps, and preserve/restore their trusted system without leaving Settings.</w:t>
+      </w:r>
+    </w:p>
+    <w:p>
+      <w:pPr/>
+      <w:r>
+        <w:t>**Backup JSON:**</w:t>
+      </w:r>
+    </w:p>
+    <w:p>
+      <w:pPr/>
+      <w:r>
+        <w:t>- Copy JSON exports the full local trusted-system snapshot using the current backup schema.</w:t>
+      </w:r>
+    </w:p>
+    <w:p>
+      <w:pPr/>
+      <w:r>
+        <w:t>- Import JSON restores a Zoro backup snapshot after an explicit confirmation prompt.</w:t>
+      </w:r>
+    </w:p>
+    <w:p>
+      <w:pPr/>
+      <w:r>
+        <w:t>- JSON import is replace/restore mode: it replaces current Inbox, Tasks, Projects, Someday/Maybe, Reference, Waiting For, settings, contexts, horizons, and weekly review progress.</w:t>
+      </w:r>
+    </w:p>
+    <w:p>
+      <w:pPr/>
+      <w:r>
+        <w:t>- Import must preserve entity IDs so linked projects, tasks, steps, and calendar entries remain connected.</w:t>
+      </w:r>
+    </w:p>
+    <w:p>
+      <w:pPr/>
+      <w:r>
+        <w:t>**Spreadsheet Upload:**</w:t>
+      </w:r>
+    </w:p>
+    <w:p>
+      <w:pPr/>
+      <w:r>
+        <w:t>- Upload Tasks accepts `.xlsx` spreadsheets for bulk capture.</w:t>
+      </w:r>
+    </w:p>
+    <w:p>
+      <w:pPr/>
+      <w:r>
+        <w:t>- Supported columns: `serial number`, `task`, and optional `category`.</w:t>
+      </w:r>
+    </w:p>
+    <w:p>
+      <w:pPr/>
+      <w:r>
+        <w:t>- `task` is required. `category` is optional. Empty task rows are skipped and reported.</w:t>
+      </w:r>
+    </w:p>
+    <w:p>
+      <w:pPr/>
+      <w:r>
+        <w:t>- Each imported row becomes one Inbox capture using `CaptureSource.import`.</w:t>
+      </w:r>
+    </w:p>
+    <w:p>
+      <w:pPr/>
+      <w:r>
+        <w:t>- Row values are concatenated into one capture string, e.g. `1 - Call bank - Finance`.</w:t>
+      </w:r>
+    </w:p>
+    <w:p>
+      <w:pPr/>
+      <w:r>
+        <w:t>- Imported items stay unclarified in Inbox so users can process them through the normal GTD clarify flow.</w:t>
+      </w:r>
+    </w:p>
+    <w:p/>
+    <w:p/>
+    <w:p>
+      <w:r>
+        <w:t xml:space="preserve"># </w:t>
+      </w:r>
+      <w:r>
+        <w:t>Zoro</w:t>
+      </w:r>
+      <w:r>
+        <w:t xml:space="preserve">| Part 3: </w:t>
       </w:r>
       <w:proofErr w:type="spellStart"/>
       <w:r>
@@ -2967,7 +3068,13 @@
     <w:p/>
     <w:p>
       <w:r>
-        <w:t># Clarity - GTD App | Part 4: Use Cases, Repositories &amp; Database Schemas</w:t>
+        <w:t xml:space="preserve"># </w:t>
+      </w:r>
+      <w:r>
+        <w:t>Zoro</w:t>
+      </w:r>
+      <w:r>
+        <w:t>| Part 4: Use Cases, Repositories &amp; Database Schemas</w:t>
       </w:r>
     </w:p>
     <w:p/>
@@ -3688,6 +3795,18 @@
       </w:r>
       <w:proofErr w:type="spellEnd"/>
     </w:p>
+    <w:p>
+      <w:pPr/>
+      <w:r>
+        <w:t>ImportBackupUseCase</w:t>
+      </w:r>
+    </w:p>
+    <w:p>
+      <w:pPr/>
+      <w:r>
+        <w:t>BulkCaptureSpreadsheetParser / parseBulkCaptureSpreadsheet</w:t>
+      </w:r>
+    </w:p>
     <w:p/>
     <w:p>
       <w:r>
@@ -4279,7 +4398,13 @@
     <w:p/>
     <w:p>
       <w:r>
-        <w:t xml:space="preserve"># Clarity - GTD App | Part 5: </w:t>
+        <w:t xml:space="preserve"># </w:t>
+      </w:r>
+      <w:r>
+        <w:t>Zoro</w:t>
+      </w:r>
+      <w:r>
+        <w:t xml:space="preserve">| Part 5: </w:t>
       </w:r>
       <w:proofErr w:type="spellStart"/>
       <w:r>
@@ -5361,7 +5486,7 @@
     </w:p>
     <w:p>
       <w:r>
-        <w:t>- Settings + Context Management</w:t>
+        <w:t>- Settings + Context Management + Import/Backup</w:t>
       </w:r>
     </w:p>
     <w:p>
@@ -5399,7 +5524,7 @@
     </w:p>
     <w:p>
       <w:r>
-        <w:t>- Keep UI very clean and fast — users should feel calm when using the app.</w:t>
+        <w:t>- Keep UI very clean and fast - users should feel calm when using the app.</w:t>
       </w:r>
     </w:p>
     <w:p/>

</xml_diff>